<commit_message>
feat: add cover letter template
</commit_message>
<xml_diff>
--- a/static/curriculum-vitae.docx
+++ b/static/curriculum-vitae.docx
@@ -159,7 +159,7 @@
         </w:rPr>
         <w:t xml:space="preserve">     </w:t>
       </w:r>
-      <w:hyperlink r:id="rId5" w:history="1">
+      <w:hyperlink r:id="rId7" w:history="1">
         <w:r>
           <w:rPr>
             <w:rStyle w:val="Collegamentoipertestuale"/>
@@ -201,7 +201,7 @@
           <w:szCs w:val="20"/>
           <w:lang w:val="en-US"/>
         </w:rPr>
-        <w:t xml:space="preserve">     </w:t>
+        <w:t xml:space="preserve">     (</w:t>
       </w:r>
       <w:r>
         <w:rPr>
@@ -221,7 +221,7 @@
           <w:szCs w:val="20"/>
           <w:lang w:val="en-US"/>
         </w:rPr>
-        <w:t>(39) 351</w:t>
+        <w:t>39) 351</w:t>
       </w:r>
       <w:r>
         <w:rPr>
@@ -231,7 +231,7 @@
           <w:szCs w:val="20"/>
           <w:lang w:val="en-US"/>
         </w:rPr>
-        <w:t>.</w:t>
+        <w:t xml:space="preserve"> </w:t>
       </w:r>
       <w:r>
         <w:rPr>
@@ -251,7 +251,7 @@
           <w:szCs w:val="20"/>
           <w:lang w:val="en-US"/>
         </w:rPr>
-        <w:t>.</w:t>
+        <w:t xml:space="preserve"> </w:t>
       </w:r>
       <w:r>
         <w:rPr>
@@ -291,22 +291,1207 @@
     </w:p>
     <w:p>
       <w:pPr>
-        <w:rPr>
-          <w:rFonts w:ascii="IBM Plex Sans" w:hAnsi="IBM Plex Sans"/>
-          <w:color w:val="111827"/>
-          <w:lang w:val="en-US"/>
-        </w:rPr>
-      </w:pPr>
-      <w:r>
-        <w:rPr>
-          <w:rFonts w:ascii="IBM Plex Sans" w:hAnsi="IBM Plex Sans"/>
-          <w:color w:val="111827"/>
-          <w:lang w:val="en-US"/>
-        </w:rPr>
-        <w:t>Software developer proficient in creating solutions using HTML, CSS, and JavaScript.</w:t>
-      </w:r>
+        <w:pStyle w:val="Titolo1"/>
+        <w:spacing w:before="0" w:after="0"/>
+        <w:jc w:val="center"/>
+        <w:rPr>
+          <w:rFonts w:ascii="IBM Plex Sans" w:hAnsi="IBM Plex Sans"/>
+          <w:color w:val="6B7280"/>
+          <w:sz w:val="24"/>
+          <w:szCs w:val="24"/>
+          <w:lang w:val="en-US"/>
+        </w:rPr>
+      </w:pPr>
+      <w:r>
+        <w:rPr>
+          <w:rFonts w:ascii="IBM Plex Sans" w:hAnsi="IBM Plex Sans"/>
+          <w:color w:val="6B7280"/>
+          <w:sz w:val="24"/>
+          <w:szCs w:val="24"/>
+          <w:lang w:val="en-US"/>
+        </w:rPr>
+        <w:t>SUMMARY</w:t>
+      </w:r>
+    </w:p>
+    <w:p>
+      <w:pPr>
+        <w:rPr>
+          <w:rFonts w:ascii="IBM Plex Sans" w:hAnsi="IBM Plex Sans"/>
+          <w:sz w:val="18"/>
+          <w:szCs w:val="18"/>
+          <w:lang w:val="en-US"/>
+        </w:rPr>
+      </w:pPr>
+    </w:p>
+    <w:p>
+      <w:pPr>
+        <w:spacing w:line="360" w:lineRule="auto"/>
+        <w:rPr>
+          <w:rFonts w:ascii="IBM Plex Sans" w:hAnsi="IBM Plex Sans"/>
+          <w:color w:val="111827"/>
+          <w:lang w:val="en-US"/>
+        </w:rPr>
+      </w:pPr>
+      <w:r>
+        <w:rPr>
+          <w:rFonts w:ascii="IBM Plex Sans" w:hAnsi="IBM Plex Sans"/>
+          <w:color w:val="111827"/>
+          <w:lang w:val="en-US"/>
+        </w:rPr>
+        <w:t xml:space="preserve">Software developer </w:t>
+      </w:r>
+      <w:r>
+        <w:rPr>
+          <w:rFonts w:ascii="IBM Plex Sans" w:hAnsi="IBM Plex Sans"/>
+          <w:color w:val="111827"/>
+          <w:lang w:val="en-US"/>
+        </w:rPr>
+        <w:t>with over 5 years of experience</w:t>
+      </w:r>
+      <w:r>
+        <w:rPr>
+          <w:rFonts w:ascii="IBM Plex Sans" w:hAnsi="IBM Plex Sans"/>
+          <w:color w:val="111827"/>
+          <w:lang w:val="en-US"/>
+        </w:rPr>
+        <w:t xml:space="preserve"> creating solutions using HTML, CSS, and JavaScript</w:t>
+      </w:r>
+      <w:r>
+        <w:rPr>
+          <w:rFonts w:ascii="IBM Plex Sans" w:hAnsi="IBM Plex Sans"/>
+          <w:color w:val="111827"/>
+          <w:lang w:val="en-US"/>
+        </w:rPr>
+        <w:t>.</w:t>
+      </w:r>
+      <w:r>
+        <w:rPr>
+          <w:rFonts w:ascii="IBM Plex Sans" w:hAnsi="IBM Plex Sans"/>
+          <w:color w:val="111827"/>
+          <w:lang w:val="en-US"/>
+        </w:rPr>
+        <w:t xml:space="preserve"> Skilled </w:t>
+      </w:r>
+      <w:r>
+        <w:rPr>
+          <w:rFonts w:ascii="IBM Plex Sans" w:hAnsi="IBM Plex Sans"/>
+          <w:color w:val="111827"/>
+          <w:lang w:val="en-US"/>
+        </w:rPr>
+        <w:t xml:space="preserve">in </w:t>
+      </w:r>
+      <w:r>
+        <w:rPr>
+          <w:rFonts w:ascii="IBM Plex Sans" w:hAnsi="IBM Plex Sans"/>
+          <w:color w:val="111827"/>
+          <w:lang w:val="en-US"/>
+        </w:rPr>
+        <w:t>agile</w:t>
+      </w:r>
+      <w:r>
+        <w:rPr>
+          <w:rFonts w:ascii="IBM Plex Sans" w:hAnsi="IBM Plex Sans"/>
+          <w:color w:val="111827"/>
+          <w:lang w:val="en-US"/>
+        </w:rPr>
+        <w:t xml:space="preserve"> methodologies</w:t>
+      </w:r>
+      <w:r>
+        <w:rPr>
+          <w:rFonts w:ascii="IBM Plex Sans" w:hAnsi="IBM Plex Sans"/>
+          <w:color w:val="111827"/>
+          <w:lang w:val="en-US"/>
+        </w:rPr>
+        <w:t>, stakeholder communication, and risk management.</w:t>
+      </w:r>
+      <w:r>
+        <w:rPr>
+          <w:rFonts w:ascii="IBM Plex Sans" w:hAnsi="IBM Plex Sans"/>
+          <w:color w:val="111827"/>
+          <w:lang w:val="en-US"/>
+        </w:rPr>
+        <w:t xml:space="preserve"> Adept at improving </w:t>
+      </w:r>
+      <w:r>
+        <w:rPr>
+          <w:rFonts w:ascii="IBM Plex Sans" w:hAnsi="IBM Plex Sans"/>
+          <w:color w:val="111827"/>
+          <w:lang w:val="en-US"/>
+        </w:rPr>
+        <w:t>processes and aligning project objectives with strategic goals.</w:t>
+      </w:r>
+    </w:p>
+    <w:p>
+      <w:pPr>
+        <w:pBdr>
+          <w:bottom w:val="single" w:sz="6" w:space="1" w:color="E5E7EC"/>
+        </w:pBdr>
+        <w:rPr>
+          <w:rFonts w:ascii="IBM Plex Sans" w:hAnsi="IBM Plex Sans"/>
+          <w:color w:val="111827"/>
+          <w:sz w:val="18"/>
+          <w:szCs w:val="18"/>
+          <w:lang w:val="en-US"/>
+        </w:rPr>
+      </w:pPr>
+    </w:p>
+    <w:p>
+      <w:pPr>
+        <w:rPr>
+          <w:rFonts w:ascii="IBM Plex Sans" w:hAnsi="IBM Plex Sans"/>
+          <w:color w:val="111827"/>
+          <w:sz w:val="18"/>
+          <w:szCs w:val="18"/>
+          <w:lang w:val="en-US"/>
+        </w:rPr>
+      </w:pPr>
+    </w:p>
+    <w:p>
+      <w:pPr>
+        <w:pStyle w:val="Titolo1"/>
+        <w:spacing w:before="0" w:after="0"/>
+        <w:jc w:val="center"/>
+        <w:rPr>
+          <w:rFonts w:ascii="IBM Plex Sans" w:hAnsi="IBM Plex Sans"/>
+          <w:color w:val="6B7280"/>
+          <w:sz w:val="24"/>
+          <w:szCs w:val="24"/>
+          <w:lang w:val="en-US"/>
+        </w:rPr>
+      </w:pPr>
+      <w:r>
+        <w:rPr>
+          <w:rFonts w:ascii="IBM Plex Sans" w:hAnsi="IBM Plex Sans"/>
+          <w:color w:val="6B7280"/>
+          <w:sz w:val="24"/>
+          <w:szCs w:val="24"/>
+          <w:lang w:val="en-US"/>
+        </w:rPr>
+        <w:t>EXPERIENCE</w:t>
+      </w:r>
+    </w:p>
+    <w:p>
+      <w:pPr>
+        <w:rPr>
+          <w:rFonts w:ascii="IBM Plex Sans" w:hAnsi="IBM Plex Sans"/>
+          <w:color w:val="111827"/>
+          <w:sz w:val="18"/>
+          <w:szCs w:val="18"/>
+          <w:lang w:val="en-US"/>
+        </w:rPr>
+      </w:pPr>
+    </w:p>
+    <w:p>
+      <w:pPr>
+        <w:rPr>
+          <w:rFonts w:ascii="IBM Plex Sans" w:hAnsi="IBM Plex Sans"/>
+          <w:color w:val="111827"/>
+          <w:sz w:val="18"/>
+          <w:szCs w:val="18"/>
+          <w:lang w:val="en-US"/>
+        </w:rPr>
+      </w:pPr>
+    </w:p>
+    <w:p>
+      <w:pPr>
+        <w:rPr>
+          <w:rFonts w:ascii="IBM Plex Sans" w:hAnsi="IBM Plex Sans"/>
+          <w:color w:val="111827"/>
+          <w:sz w:val="18"/>
+          <w:szCs w:val="18"/>
+          <w:lang w:val="en-US"/>
+        </w:rPr>
+      </w:pPr>
+    </w:p>
+    <w:p>
+      <w:pPr>
+        <w:rPr>
+          <w:rFonts w:ascii="IBM Plex Sans" w:hAnsi="IBM Plex Sans"/>
+          <w:color w:val="111827"/>
+          <w:sz w:val="18"/>
+          <w:szCs w:val="18"/>
+          <w:lang w:val="en-US"/>
+        </w:rPr>
+      </w:pPr>
+    </w:p>
+    <w:p>
+      <w:pPr>
+        <w:rPr>
+          <w:rFonts w:ascii="IBM Plex Sans" w:hAnsi="IBM Plex Sans"/>
+          <w:color w:val="111827"/>
+          <w:sz w:val="18"/>
+          <w:szCs w:val="18"/>
+          <w:lang w:val="en-US"/>
+        </w:rPr>
+      </w:pPr>
+    </w:p>
+    <w:p>
+      <w:pPr>
+        <w:rPr>
+          <w:rFonts w:ascii="IBM Plex Sans" w:hAnsi="IBM Plex Sans"/>
+          <w:color w:val="111827"/>
+          <w:sz w:val="18"/>
+          <w:szCs w:val="18"/>
+          <w:lang w:val="en-US"/>
+        </w:rPr>
+      </w:pPr>
+    </w:p>
+    <w:p>
+      <w:pPr>
+        <w:rPr>
+          <w:rFonts w:ascii="IBM Plex Sans" w:hAnsi="IBM Plex Sans"/>
+          <w:color w:val="111827"/>
+          <w:sz w:val="18"/>
+          <w:szCs w:val="18"/>
+          <w:lang w:val="en-US"/>
+        </w:rPr>
+      </w:pPr>
+    </w:p>
+    <w:p>
+      <w:pPr>
+        <w:rPr>
+          <w:rFonts w:ascii="IBM Plex Sans" w:hAnsi="IBM Plex Sans"/>
+          <w:color w:val="111827"/>
+          <w:sz w:val="18"/>
+          <w:szCs w:val="18"/>
+          <w:lang w:val="en-US"/>
+        </w:rPr>
+      </w:pPr>
+    </w:p>
+    <w:p>
+      <w:pPr>
+        <w:rPr>
+          <w:rFonts w:ascii="IBM Plex Sans" w:hAnsi="IBM Plex Sans"/>
+          <w:color w:val="111827"/>
+          <w:sz w:val="18"/>
+          <w:szCs w:val="18"/>
+          <w:lang w:val="en-US"/>
+        </w:rPr>
+      </w:pPr>
+    </w:p>
+    <w:p>
+      <w:pPr>
+        <w:rPr>
+          <w:rFonts w:ascii="IBM Plex Sans" w:hAnsi="IBM Plex Sans"/>
+          <w:color w:val="111827"/>
+          <w:sz w:val="18"/>
+          <w:szCs w:val="18"/>
+          <w:lang w:val="en-US"/>
+        </w:rPr>
+      </w:pPr>
+    </w:p>
+    <w:p>
+      <w:pPr>
+        <w:rPr>
+          <w:rFonts w:ascii="IBM Plex Sans" w:hAnsi="IBM Plex Sans"/>
+          <w:color w:val="111827"/>
+          <w:sz w:val="18"/>
+          <w:szCs w:val="18"/>
+          <w:lang w:val="en-US"/>
+        </w:rPr>
+      </w:pPr>
+    </w:p>
+    <w:p>
+      <w:pPr>
+        <w:rPr>
+          <w:rFonts w:ascii="IBM Plex Sans" w:hAnsi="IBM Plex Sans"/>
+          <w:color w:val="111827"/>
+          <w:sz w:val="18"/>
+          <w:szCs w:val="18"/>
+          <w:lang w:val="en-US"/>
+        </w:rPr>
+      </w:pPr>
+    </w:p>
+    <w:p>
+      <w:pPr>
+        <w:rPr>
+          <w:rFonts w:ascii="IBM Plex Sans" w:hAnsi="IBM Plex Sans"/>
+          <w:color w:val="111827"/>
+          <w:sz w:val="18"/>
+          <w:szCs w:val="18"/>
+          <w:lang w:val="en-US"/>
+        </w:rPr>
+      </w:pPr>
+    </w:p>
+    <w:p>
+      <w:pPr>
+        <w:pStyle w:val="Titolo1"/>
+        <w:spacing w:before="0" w:after="0"/>
+        <w:jc w:val="center"/>
+        <w:rPr>
+          <w:rFonts w:ascii="IBM Plex Sans" w:hAnsi="IBM Plex Sans"/>
+          <w:color w:val="6B7280"/>
+          <w:sz w:val="24"/>
+          <w:szCs w:val="24"/>
+          <w:lang w:val="en-US"/>
+        </w:rPr>
+      </w:pPr>
+      <w:r>
+        <w:rPr>
+          <w:rFonts w:ascii="IBM Plex Sans" w:hAnsi="IBM Plex Sans"/>
+          <w:color w:val="6B7280"/>
+          <w:sz w:val="24"/>
+          <w:szCs w:val="24"/>
+          <w:lang w:val="en-US"/>
+        </w:rPr>
+        <w:t>SKILLS</w:t>
+      </w:r>
+    </w:p>
+    <w:p>
+      <w:pPr>
+        <w:rPr>
+          <w:rFonts w:ascii="IBM Plex Sans" w:hAnsi="IBM Plex Sans"/>
+          <w:sz w:val="18"/>
+          <w:szCs w:val="18"/>
+          <w:lang w:val="en-US"/>
+        </w:rPr>
+      </w:pPr>
+    </w:p>
+    <w:p>
+      <w:pPr>
+        <w:spacing w:line="360" w:lineRule="auto"/>
+        <w:rPr>
+          <w:rFonts w:ascii="IBM Plex Sans" w:hAnsi="IBM Plex Sans"/>
+          <w:color w:val="111827"/>
+          <w:lang w:val="en-US"/>
+        </w:rPr>
+      </w:pPr>
+      <w:r>
+        <w:rPr>
+          <w:rFonts w:ascii="IBM Plex Sans" w:hAnsi="IBM Plex Sans"/>
+          <w:color w:val="111827"/>
+          <w:lang w:val="en-US"/>
+        </w:rPr>
+        <w:t xml:space="preserve">Agile </w:t>
+      </w:r>
+      <w:r>
+        <w:rPr>
+          <w:rFonts w:ascii="IBM Plex Sans" w:hAnsi="IBM Plex Sans"/>
+          <w:color w:val="6B7280"/>
+          <w:lang w:val="en-US"/>
+        </w:rPr>
+        <w:t>•</w:t>
+      </w:r>
+      <w:r>
+        <w:rPr>
+          <w:rFonts w:ascii="IBM Plex Sans" w:hAnsi="IBM Plex Sans"/>
+          <w:color w:val="6B7280"/>
+          <w:lang w:val="en-US"/>
+        </w:rPr>
+        <w:t xml:space="preserve"> </w:t>
+      </w:r>
+      <w:r>
+        <w:rPr>
+          <w:rFonts w:ascii="IBM Plex Sans" w:hAnsi="IBM Plex Sans"/>
+          <w:color w:val="111827"/>
+          <w:lang w:val="en-US"/>
+        </w:rPr>
+        <w:t>A</w:t>
+      </w:r>
+      <w:r>
+        <w:rPr>
+          <w:rFonts w:ascii="IBM Plex Sans" w:hAnsi="IBM Plex Sans"/>
+          <w:color w:val="111827"/>
+          <w:lang w:val="en-US"/>
+        </w:rPr>
+        <w:t xml:space="preserve">ngular </w:t>
+      </w:r>
+      <w:r>
+        <w:rPr>
+          <w:rFonts w:ascii="IBM Plex Sans" w:hAnsi="IBM Plex Sans"/>
+          <w:color w:val="6B7280"/>
+          <w:lang w:val="en-US"/>
+        </w:rPr>
+        <w:t>•</w:t>
+      </w:r>
+      <w:r>
+        <w:rPr>
+          <w:rFonts w:ascii="IBM Plex Sans" w:hAnsi="IBM Plex Sans"/>
+          <w:color w:val="6B7280"/>
+          <w:lang w:val="en-US"/>
+        </w:rPr>
+        <w:t xml:space="preserve"> A</w:t>
+      </w:r>
+      <w:r>
+        <w:rPr>
+          <w:rFonts w:ascii="IBM Plex Sans" w:hAnsi="IBM Plex Sans"/>
+          <w:color w:val="111827"/>
+          <w:lang w:val="en-US"/>
+        </w:rPr>
+        <w:t>rtificial Intelligence</w:t>
+      </w:r>
+      <w:r>
+        <w:rPr>
+          <w:rFonts w:ascii="IBM Plex Sans" w:hAnsi="IBM Plex Sans"/>
+          <w:color w:val="111827"/>
+          <w:lang w:val="en-US"/>
+        </w:rPr>
+        <w:t xml:space="preserve"> </w:t>
+      </w:r>
+      <w:r>
+        <w:rPr>
+          <w:rFonts w:ascii="IBM Plex Sans" w:hAnsi="IBM Plex Sans"/>
+          <w:color w:val="6B7280"/>
+          <w:lang w:val="en-US"/>
+        </w:rPr>
+        <w:t>•</w:t>
+      </w:r>
+      <w:r>
+        <w:rPr>
+          <w:rFonts w:ascii="IBM Plex Sans" w:hAnsi="IBM Plex Sans"/>
+          <w:color w:val="111827"/>
+          <w:lang w:val="en-US"/>
+        </w:rPr>
+        <w:t xml:space="preserve"> </w:t>
+      </w:r>
+      <w:r>
+        <w:rPr>
+          <w:rFonts w:ascii="IBM Plex Sans" w:hAnsi="IBM Plex Sans"/>
+          <w:color w:val="111827"/>
+          <w:lang w:val="en-US"/>
+        </w:rPr>
+        <w:t xml:space="preserve">AWS </w:t>
+      </w:r>
+      <w:r>
+        <w:rPr>
+          <w:rFonts w:ascii="IBM Plex Sans" w:hAnsi="IBM Plex Sans"/>
+          <w:color w:val="6B7280"/>
+          <w:lang w:val="en-US"/>
+        </w:rPr>
+        <w:t>•</w:t>
+      </w:r>
+      <w:r>
+        <w:rPr>
+          <w:rFonts w:ascii="IBM Plex Sans" w:hAnsi="IBM Plex Sans"/>
+          <w:color w:val="6B7280"/>
+          <w:lang w:val="en-US"/>
+        </w:rPr>
+        <w:t xml:space="preserve"> </w:t>
+      </w:r>
+      <w:r>
+        <w:rPr>
+          <w:rFonts w:ascii="IBM Plex Sans" w:hAnsi="IBM Plex Sans"/>
+          <w:color w:val="111827"/>
+          <w:lang w:val="en-US"/>
+        </w:rPr>
+        <w:t>B</w:t>
+      </w:r>
+      <w:r>
+        <w:rPr>
+          <w:rFonts w:ascii="IBM Plex Sans" w:hAnsi="IBM Plex Sans"/>
+          <w:color w:val="111827"/>
+          <w:lang w:val="en-US"/>
+        </w:rPr>
+        <w:t>ack-End Development</w:t>
+      </w:r>
+      <w:r>
+        <w:rPr>
+          <w:rFonts w:ascii="IBM Plex Sans" w:hAnsi="IBM Plex Sans"/>
+          <w:color w:val="111827"/>
+          <w:lang w:val="en-US"/>
+        </w:rPr>
+        <w:t xml:space="preserve"> </w:t>
+      </w:r>
+      <w:r>
+        <w:rPr>
+          <w:rFonts w:ascii="IBM Plex Sans" w:hAnsi="IBM Plex Sans"/>
+          <w:color w:val="6B7280"/>
+          <w:lang w:val="en-US"/>
+        </w:rPr>
+        <w:t xml:space="preserve">• </w:t>
+      </w:r>
+      <w:r>
+        <w:rPr>
+          <w:rFonts w:ascii="IBM Plex Sans" w:hAnsi="IBM Plex Sans"/>
+          <w:color w:val="111827"/>
+          <w:lang w:val="en-US"/>
+        </w:rPr>
+        <w:t xml:space="preserve">Business Intelligence </w:t>
+      </w:r>
+      <w:r>
+        <w:rPr>
+          <w:rFonts w:ascii="IBM Plex Sans" w:hAnsi="IBM Plex Sans"/>
+          <w:color w:val="6B7280"/>
+          <w:lang w:val="en-US"/>
+        </w:rPr>
+        <w:t>•</w:t>
+      </w:r>
+      <w:r>
+        <w:rPr>
+          <w:rFonts w:ascii="IBM Plex Sans" w:hAnsi="IBM Plex Sans"/>
+          <w:color w:val="111827"/>
+          <w:lang w:val="en-US"/>
+        </w:rPr>
+        <w:t xml:space="preserve"> </w:t>
+      </w:r>
+      <w:r>
+        <w:rPr>
+          <w:rFonts w:ascii="IBM Plex Sans" w:hAnsi="IBM Plex Sans"/>
+          <w:color w:val="111827"/>
+          <w:lang w:val="en-US"/>
+        </w:rPr>
+        <w:t xml:space="preserve">Docker </w:t>
+      </w:r>
+      <w:r>
+        <w:rPr>
+          <w:rFonts w:ascii="IBM Plex Sans" w:hAnsi="IBM Plex Sans"/>
+          <w:color w:val="6B7280"/>
+          <w:lang w:val="en-US"/>
+        </w:rPr>
+        <w:t>•</w:t>
+      </w:r>
+      <w:r>
+        <w:rPr>
+          <w:rFonts w:ascii="IBM Plex Sans" w:hAnsi="IBM Plex Sans"/>
+          <w:color w:val="6B7280"/>
+          <w:lang w:val="en-US"/>
+        </w:rPr>
+        <w:t xml:space="preserve"> F</w:t>
+      </w:r>
+      <w:r>
+        <w:rPr>
+          <w:rFonts w:ascii="IBM Plex Sans" w:hAnsi="IBM Plex Sans"/>
+          <w:color w:val="111827"/>
+          <w:lang w:val="en-US"/>
+        </w:rPr>
+        <w:t xml:space="preserve">ront-End Development </w:t>
+      </w:r>
+      <w:r>
+        <w:rPr>
+          <w:rFonts w:ascii="IBM Plex Sans" w:hAnsi="IBM Plex Sans"/>
+          <w:color w:val="6B7280"/>
+          <w:lang w:val="en-US"/>
+        </w:rPr>
+        <w:t>•</w:t>
+      </w:r>
+      <w:r>
+        <w:rPr>
+          <w:rFonts w:ascii="IBM Plex Sans" w:hAnsi="IBM Plex Sans"/>
+          <w:color w:val="6B7280"/>
+          <w:lang w:val="en-US"/>
+        </w:rPr>
+        <w:t xml:space="preserve"> </w:t>
+      </w:r>
+      <w:r>
+        <w:rPr>
+          <w:rFonts w:ascii="IBM Plex Sans" w:hAnsi="IBM Plex Sans"/>
+          <w:color w:val="111827"/>
+          <w:lang w:val="en-US"/>
+        </w:rPr>
+        <w:t xml:space="preserve">Google Cloud Platform </w:t>
+      </w:r>
+      <w:r>
+        <w:rPr>
+          <w:rFonts w:ascii="IBM Plex Sans" w:hAnsi="IBM Plex Sans"/>
+          <w:color w:val="6B7280"/>
+          <w:lang w:val="en-US"/>
+        </w:rPr>
+        <w:t>•</w:t>
+      </w:r>
+      <w:r>
+        <w:rPr>
+          <w:rFonts w:ascii="IBM Plex Sans" w:hAnsi="IBM Plex Sans"/>
+          <w:color w:val="6B7280"/>
+          <w:lang w:val="en-US"/>
+        </w:rPr>
+        <w:t xml:space="preserve"> </w:t>
+      </w:r>
+      <w:r>
+        <w:rPr>
+          <w:rFonts w:ascii="IBM Plex Sans" w:hAnsi="IBM Plex Sans"/>
+          <w:color w:val="111827"/>
+          <w:lang w:val="en-US"/>
+        </w:rPr>
+        <w:t xml:space="preserve">Kanban </w:t>
+      </w:r>
+      <w:r>
+        <w:rPr>
+          <w:rFonts w:ascii="IBM Plex Sans" w:hAnsi="IBM Plex Sans"/>
+          <w:color w:val="6B7280"/>
+          <w:lang w:val="en-US"/>
+        </w:rPr>
+        <w:t>•</w:t>
+      </w:r>
+      <w:r>
+        <w:rPr>
+          <w:rFonts w:ascii="IBM Plex Sans" w:hAnsi="IBM Plex Sans"/>
+          <w:color w:val="6B7280"/>
+          <w:lang w:val="en-US"/>
+        </w:rPr>
+        <w:t xml:space="preserve"> </w:t>
+      </w:r>
+      <w:r>
+        <w:rPr>
+          <w:rFonts w:ascii="IBM Plex Sans" w:hAnsi="IBM Plex Sans"/>
+          <w:color w:val="111827"/>
+          <w:lang w:val="en-US"/>
+        </w:rPr>
+        <w:t xml:space="preserve">Jira </w:t>
+      </w:r>
+      <w:r>
+        <w:rPr>
+          <w:rFonts w:ascii="IBM Plex Sans" w:hAnsi="IBM Plex Sans"/>
+          <w:color w:val="6B7280"/>
+          <w:lang w:val="en-US"/>
+        </w:rPr>
+        <w:t>•</w:t>
+      </w:r>
+      <w:r>
+        <w:rPr>
+          <w:rFonts w:ascii="IBM Plex Sans" w:hAnsi="IBM Plex Sans"/>
+          <w:color w:val="6B7280"/>
+          <w:lang w:val="en-US"/>
+        </w:rPr>
+        <w:t xml:space="preserve"> </w:t>
+      </w:r>
+      <w:r>
+        <w:rPr>
+          <w:rFonts w:ascii="IBM Plex Sans" w:hAnsi="IBM Plex Sans"/>
+          <w:color w:val="111827"/>
+          <w:lang w:val="en-US"/>
+        </w:rPr>
+        <w:t>L</w:t>
+      </w:r>
+      <w:r>
+        <w:rPr>
+          <w:rFonts w:ascii="IBM Plex Sans" w:hAnsi="IBM Plex Sans"/>
+          <w:color w:val="111827"/>
+          <w:lang w:val="en-US"/>
+        </w:rPr>
+        <w:t>a</w:t>
+      </w:r>
+      <w:r>
+        <w:rPr>
+          <w:rFonts w:ascii="IBM Plex Sans" w:hAnsi="IBM Plex Sans"/>
+          <w:color w:val="111827"/>
+          <w:lang w:val="en-US"/>
+        </w:rPr>
+        <w:t>rge Language Model</w:t>
+      </w:r>
+      <w:r>
+        <w:rPr>
+          <w:rFonts w:ascii="IBM Plex Sans" w:hAnsi="IBM Plex Sans"/>
+          <w:color w:val="111827"/>
+          <w:lang w:val="en-US"/>
+        </w:rPr>
+        <w:t>s</w:t>
+      </w:r>
+      <w:r>
+        <w:rPr>
+          <w:rFonts w:ascii="IBM Plex Sans" w:hAnsi="IBM Plex Sans"/>
+          <w:color w:val="111827"/>
+          <w:lang w:val="en-US"/>
+        </w:rPr>
+        <w:t xml:space="preserve"> </w:t>
+      </w:r>
+      <w:r>
+        <w:rPr>
+          <w:rFonts w:ascii="IBM Plex Sans" w:hAnsi="IBM Plex Sans"/>
+          <w:color w:val="6B7280"/>
+          <w:lang w:val="en-US"/>
+        </w:rPr>
+        <w:t>•</w:t>
+      </w:r>
+      <w:r>
+        <w:rPr>
+          <w:rFonts w:ascii="IBM Plex Sans" w:hAnsi="IBM Plex Sans"/>
+          <w:color w:val="6B7280"/>
+          <w:lang w:val="en-US"/>
+        </w:rPr>
+        <w:t xml:space="preserve"> </w:t>
+      </w:r>
+      <w:r>
+        <w:rPr>
+          <w:rFonts w:ascii="IBM Plex Sans" w:hAnsi="IBM Plex Sans"/>
+          <w:color w:val="111827"/>
+          <w:lang w:val="en-US"/>
+        </w:rPr>
+        <w:t xml:space="preserve">Natural Language Processing </w:t>
+      </w:r>
+      <w:r>
+        <w:rPr>
+          <w:rFonts w:ascii="IBM Plex Sans" w:hAnsi="IBM Plex Sans"/>
+          <w:color w:val="6B7280"/>
+          <w:lang w:val="en-US"/>
+        </w:rPr>
+        <w:t>•</w:t>
+      </w:r>
+      <w:r>
+        <w:rPr>
+          <w:rFonts w:ascii="IBM Plex Sans" w:hAnsi="IBM Plex Sans"/>
+          <w:color w:val="6B7280"/>
+          <w:lang w:val="en-US"/>
+        </w:rPr>
+        <w:t xml:space="preserve"> </w:t>
+      </w:r>
+      <w:r>
+        <w:rPr>
+          <w:rFonts w:ascii="IBM Plex Sans" w:hAnsi="IBM Plex Sans"/>
+          <w:color w:val="111827"/>
+          <w:lang w:val="en-US"/>
+        </w:rPr>
+        <w:t xml:space="preserve">Node.js </w:t>
+      </w:r>
+      <w:r>
+        <w:rPr>
+          <w:rFonts w:ascii="IBM Plex Sans" w:hAnsi="IBM Plex Sans"/>
+          <w:color w:val="6B7280"/>
+          <w:lang w:val="en-US"/>
+        </w:rPr>
+        <w:t>•</w:t>
+      </w:r>
+      <w:r>
+        <w:rPr>
+          <w:rFonts w:ascii="IBM Plex Sans" w:hAnsi="IBM Plex Sans"/>
+          <w:color w:val="6B7280"/>
+          <w:lang w:val="en-US"/>
+        </w:rPr>
+        <w:t xml:space="preserve"> </w:t>
+      </w:r>
+      <w:r>
+        <w:rPr>
+          <w:rFonts w:ascii="IBM Plex Sans" w:hAnsi="IBM Plex Sans"/>
+          <w:color w:val="111827"/>
+          <w:lang w:val="en-US"/>
+        </w:rPr>
+        <w:t>P</w:t>
+      </w:r>
+      <w:r>
+        <w:rPr>
+          <w:rFonts w:ascii="IBM Plex Sans" w:hAnsi="IBM Plex Sans"/>
+          <w:color w:val="111827"/>
+          <w:lang w:val="en-US"/>
+        </w:rPr>
+        <w:t xml:space="preserve">rogramming </w:t>
+      </w:r>
+      <w:r>
+        <w:rPr>
+          <w:rFonts w:ascii="IBM Plex Sans" w:hAnsi="IBM Plex Sans"/>
+          <w:color w:val="6B7280"/>
+          <w:lang w:val="en-US"/>
+        </w:rPr>
+        <w:t xml:space="preserve">• </w:t>
+      </w:r>
+      <w:r>
+        <w:rPr>
+          <w:rFonts w:ascii="IBM Plex Sans" w:hAnsi="IBM Plex Sans"/>
+          <w:color w:val="111827"/>
+          <w:lang w:val="en-US"/>
+        </w:rPr>
+        <w:t xml:space="preserve">Project Management </w:t>
+      </w:r>
+      <w:r>
+        <w:rPr>
+          <w:rFonts w:ascii="IBM Plex Sans" w:hAnsi="IBM Plex Sans"/>
+          <w:color w:val="6B7280"/>
+          <w:lang w:val="en-US"/>
+        </w:rPr>
+        <w:t xml:space="preserve">• </w:t>
+      </w:r>
+      <w:r>
+        <w:rPr>
+          <w:rFonts w:ascii="IBM Plex Sans" w:hAnsi="IBM Plex Sans"/>
+          <w:color w:val="111827"/>
+          <w:lang w:val="en-US"/>
+        </w:rPr>
+        <w:t>Pro</w:t>
+      </w:r>
+      <w:r>
+        <w:rPr>
+          <w:rFonts w:ascii="IBM Plex Sans" w:hAnsi="IBM Plex Sans"/>
+          <w:color w:val="111827"/>
+          <w:lang w:val="en-US"/>
+        </w:rPr>
+        <w:t>mpt Engineering</w:t>
+      </w:r>
+      <w:r>
+        <w:rPr>
+          <w:rFonts w:ascii="IBM Plex Sans" w:hAnsi="IBM Plex Sans"/>
+          <w:color w:val="111827"/>
+          <w:lang w:val="en-US"/>
+        </w:rPr>
+        <w:t xml:space="preserve"> </w:t>
+      </w:r>
+      <w:r>
+        <w:rPr>
+          <w:rFonts w:ascii="IBM Plex Sans" w:hAnsi="IBM Plex Sans"/>
+          <w:color w:val="6B7280"/>
+          <w:lang w:val="en-US"/>
+        </w:rPr>
+        <w:t>•</w:t>
+      </w:r>
+      <w:r>
+        <w:rPr>
+          <w:rFonts w:ascii="IBM Plex Sans" w:hAnsi="IBM Plex Sans"/>
+          <w:color w:val="6B7280"/>
+          <w:lang w:val="en-US"/>
+        </w:rPr>
+        <w:t xml:space="preserve"> </w:t>
+      </w:r>
+      <w:r>
+        <w:rPr>
+          <w:rFonts w:ascii="IBM Plex Sans" w:hAnsi="IBM Plex Sans"/>
+          <w:color w:val="111827"/>
+          <w:lang w:val="en-US"/>
+        </w:rPr>
+        <w:t xml:space="preserve">React </w:t>
+      </w:r>
+      <w:r>
+        <w:rPr>
+          <w:rFonts w:ascii="IBM Plex Sans" w:hAnsi="IBM Plex Sans"/>
+          <w:color w:val="6B7280"/>
+          <w:lang w:val="en-US"/>
+        </w:rPr>
+        <w:t>•</w:t>
+      </w:r>
+      <w:r>
+        <w:rPr>
+          <w:rFonts w:ascii="IBM Plex Sans" w:hAnsi="IBM Plex Sans"/>
+          <w:color w:val="6B7280"/>
+          <w:lang w:val="en-US"/>
+        </w:rPr>
+        <w:t xml:space="preserve"> </w:t>
+      </w:r>
+      <w:r>
+        <w:rPr>
+          <w:rFonts w:ascii="IBM Plex Sans" w:hAnsi="IBM Plex Sans"/>
+          <w:color w:val="111827"/>
+          <w:lang w:val="en-US"/>
+        </w:rPr>
+        <w:t>S</w:t>
+      </w:r>
+      <w:r>
+        <w:rPr>
+          <w:rFonts w:ascii="IBM Plex Sans" w:hAnsi="IBM Plex Sans"/>
+          <w:color w:val="111827"/>
+          <w:lang w:val="en-US"/>
+        </w:rPr>
+        <w:t xml:space="preserve">ass </w:t>
+      </w:r>
+      <w:r>
+        <w:rPr>
+          <w:rFonts w:ascii="IBM Plex Sans" w:hAnsi="IBM Plex Sans"/>
+          <w:color w:val="6B7280"/>
+          <w:lang w:val="en-US"/>
+        </w:rPr>
+        <w:t>•</w:t>
+      </w:r>
+      <w:r>
+        <w:rPr>
+          <w:rFonts w:ascii="IBM Plex Sans" w:hAnsi="IBM Plex Sans"/>
+          <w:color w:val="6B7280"/>
+          <w:lang w:val="en-US"/>
+        </w:rPr>
+        <w:t xml:space="preserve"> </w:t>
+      </w:r>
+      <w:r>
+        <w:rPr>
+          <w:rFonts w:ascii="IBM Plex Sans" w:hAnsi="IBM Plex Sans"/>
+          <w:color w:val="111827"/>
+          <w:lang w:val="en-US"/>
+        </w:rPr>
+        <w:t>S</w:t>
+      </w:r>
+      <w:r>
+        <w:rPr>
+          <w:rFonts w:ascii="IBM Plex Sans" w:hAnsi="IBM Plex Sans"/>
+          <w:color w:val="111827"/>
+          <w:lang w:val="en-US"/>
+        </w:rPr>
+        <w:t>crum</w:t>
+      </w:r>
+      <w:r>
+        <w:rPr>
+          <w:rFonts w:ascii="IBM Plex Sans" w:hAnsi="IBM Plex Sans"/>
+          <w:color w:val="111827"/>
+          <w:lang w:val="en-US"/>
+        </w:rPr>
+        <w:t xml:space="preserve"> </w:t>
+      </w:r>
+      <w:r>
+        <w:rPr>
+          <w:rFonts w:ascii="IBM Plex Sans" w:hAnsi="IBM Plex Sans"/>
+          <w:color w:val="6B7280"/>
+          <w:lang w:val="en-US"/>
+        </w:rPr>
+        <w:t>•</w:t>
+      </w:r>
+      <w:r>
+        <w:rPr>
+          <w:rFonts w:ascii="IBM Plex Sans" w:hAnsi="IBM Plex Sans"/>
+          <w:color w:val="6B7280"/>
+          <w:lang w:val="en-US"/>
+        </w:rPr>
+        <w:t xml:space="preserve"> </w:t>
+      </w:r>
+      <w:r>
+        <w:rPr>
+          <w:rFonts w:ascii="IBM Plex Sans" w:hAnsi="IBM Plex Sans"/>
+          <w:color w:val="111827"/>
+          <w:lang w:val="en-US"/>
+        </w:rPr>
+        <w:t>SCSS</w:t>
+      </w:r>
+      <w:r>
+        <w:rPr>
+          <w:rFonts w:ascii="IBM Plex Sans" w:hAnsi="IBM Plex Sans"/>
+          <w:color w:val="111827"/>
+          <w:lang w:val="en-US"/>
+        </w:rPr>
+        <w:t xml:space="preserve"> </w:t>
+      </w:r>
+      <w:r>
+        <w:rPr>
+          <w:rFonts w:ascii="IBM Plex Sans" w:hAnsi="IBM Plex Sans"/>
+          <w:color w:val="6B7280"/>
+          <w:lang w:val="en-US"/>
+        </w:rPr>
+        <w:t>•</w:t>
+      </w:r>
+      <w:r>
+        <w:rPr>
+          <w:rFonts w:ascii="IBM Plex Sans" w:hAnsi="IBM Plex Sans"/>
+          <w:color w:val="111827"/>
+          <w:lang w:val="en-US"/>
+        </w:rPr>
+        <w:t xml:space="preserve"> </w:t>
+      </w:r>
+      <w:r>
+        <w:rPr>
+          <w:rFonts w:ascii="IBM Plex Sans" w:hAnsi="IBM Plex Sans"/>
+          <w:color w:val="111827"/>
+          <w:lang w:val="en-US"/>
+        </w:rPr>
+        <w:t xml:space="preserve">Serverless </w:t>
+      </w:r>
+      <w:r>
+        <w:rPr>
+          <w:rFonts w:ascii="IBM Plex Sans" w:hAnsi="IBM Plex Sans"/>
+          <w:color w:val="6B7280"/>
+          <w:lang w:val="en-US"/>
+        </w:rPr>
+        <w:t>•</w:t>
+      </w:r>
+      <w:r>
+        <w:rPr>
+          <w:rFonts w:ascii="IBM Plex Sans" w:hAnsi="IBM Plex Sans"/>
+          <w:color w:val="6B7280"/>
+          <w:lang w:val="en-US"/>
+        </w:rPr>
+        <w:t xml:space="preserve"> </w:t>
+      </w:r>
+      <w:r>
+        <w:rPr>
+          <w:rFonts w:ascii="IBM Plex Sans" w:hAnsi="IBM Plex Sans"/>
+          <w:color w:val="111827"/>
+          <w:lang w:val="en-US"/>
+        </w:rPr>
+        <w:t xml:space="preserve">TypeScript </w:t>
+      </w:r>
+      <w:r>
+        <w:rPr>
+          <w:rFonts w:ascii="IBM Plex Sans" w:hAnsi="IBM Plex Sans"/>
+          <w:color w:val="6B7280"/>
+          <w:lang w:val="en-US"/>
+        </w:rPr>
+        <w:t>•</w:t>
+      </w:r>
+      <w:r>
+        <w:rPr>
+          <w:rFonts w:ascii="IBM Plex Sans" w:hAnsi="IBM Plex Sans"/>
+          <w:color w:val="6B7280"/>
+          <w:lang w:val="en-US"/>
+        </w:rPr>
+        <w:t xml:space="preserve"> V</w:t>
+      </w:r>
+      <w:r>
+        <w:rPr>
+          <w:rFonts w:ascii="IBM Plex Sans" w:hAnsi="IBM Plex Sans"/>
+          <w:color w:val="111827"/>
+          <w:lang w:val="en-US"/>
+        </w:rPr>
+        <w:t xml:space="preserve">ite </w:t>
+      </w:r>
+      <w:r>
+        <w:rPr>
+          <w:rFonts w:ascii="IBM Plex Sans" w:hAnsi="IBM Plex Sans"/>
+          <w:color w:val="6B7280"/>
+          <w:lang w:val="en-US"/>
+        </w:rPr>
+        <w:t>•</w:t>
+      </w:r>
+      <w:r>
+        <w:rPr>
+          <w:rFonts w:ascii="IBM Plex Sans" w:hAnsi="IBM Plex Sans"/>
+          <w:color w:val="6B7280"/>
+          <w:lang w:val="en-US"/>
+        </w:rPr>
+        <w:t xml:space="preserve"> </w:t>
+      </w:r>
+      <w:r>
+        <w:rPr>
+          <w:rFonts w:ascii="IBM Plex Sans" w:hAnsi="IBM Plex Sans"/>
+          <w:color w:val="111827"/>
+          <w:lang w:val="en-US"/>
+        </w:rPr>
+        <w:t>V</w:t>
+      </w:r>
+      <w:r>
+        <w:rPr>
+          <w:rFonts w:ascii="IBM Plex Sans" w:hAnsi="IBM Plex Sans"/>
+          <w:color w:val="111827"/>
+          <w:lang w:val="en-US"/>
+        </w:rPr>
+        <w:t xml:space="preserve">ue.js </w:t>
+      </w:r>
+      <w:r>
+        <w:rPr>
+          <w:rFonts w:ascii="IBM Plex Sans" w:hAnsi="IBM Plex Sans"/>
+          <w:color w:val="6B7280"/>
+          <w:lang w:val="en-US"/>
+        </w:rPr>
+        <w:t>•</w:t>
+      </w:r>
+      <w:r>
+        <w:rPr>
+          <w:rFonts w:ascii="IBM Plex Sans" w:hAnsi="IBM Plex Sans"/>
+          <w:color w:val="6B7280"/>
+          <w:lang w:val="en-US"/>
+        </w:rPr>
+        <w:t xml:space="preserve"> </w:t>
+      </w:r>
+      <w:r>
+        <w:rPr>
+          <w:rFonts w:ascii="IBM Plex Sans" w:hAnsi="IBM Plex Sans"/>
+          <w:color w:val="111827"/>
+          <w:lang w:val="en-US"/>
+        </w:rPr>
+        <w:t>Waterfall</w:t>
+      </w:r>
+    </w:p>
+    <w:p>
+      <w:pPr>
+        <w:rPr>
+          <w:rFonts w:ascii="IBM Plex Sans" w:hAnsi="IBM Plex Sans"/>
+          <w:lang w:val="en-US"/>
+        </w:rPr>
+      </w:pPr>
+    </w:p>
+    <w:p>
+      <w:pPr>
+        <w:rPr>
+          <w:rFonts w:ascii="IBM Plex Sans" w:hAnsi="IBM Plex Sans"/>
+          <w:lang w:val="en-US"/>
+        </w:rPr>
+      </w:pPr>
+    </w:p>
+    <w:p>
+      <w:pPr>
+        <w:rPr>
+          <w:rFonts w:ascii="IBM Plex Sans" w:hAnsi="IBM Plex Sans"/>
+          <w:lang w:val="en-US"/>
+        </w:rPr>
+      </w:pPr>
+    </w:p>
+    <w:p>
+      <w:pPr>
+        <w:rPr>
+          <w:rFonts w:ascii="IBM Plex Sans" w:hAnsi="IBM Plex Sans"/>
+          <w:lang w:val="en-US"/>
+        </w:rPr>
+      </w:pPr>
+    </w:p>
+    <w:p>
+      <w:pPr>
+        <w:rPr>
+          <w:rFonts w:ascii="IBM Plex Sans" w:hAnsi="IBM Plex Sans"/>
+          <w:lang w:val="en-US"/>
+        </w:rPr>
+      </w:pPr>
+    </w:p>
+    <w:p>
+      <w:pPr>
+        <w:rPr>
+          <w:rFonts w:ascii="IBM Plex Sans" w:hAnsi="IBM Plex Sans"/>
+          <w:lang w:val="en-US"/>
+        </w:rPr>
+      </w:pPr>
+    </w:p>
+    <w:p>
+      <w:pPr>
+        <w:rPr>
+          <w:rFonts w:ascii="IBM Plex Sans" w:hAnsi="IBM Plex Sans"/>
+          <w:lang w:val="en-US"/>
+        </w:rPr>
+      </w:pPr>
+    </w:p>
+    <w:p>
+      <w:pPr>
+        <w:rPr>
+          <w:rFonts w:ascii="IBM Plex Sans" w:hAnsi="IBM Plex Sans"/>
+          <w:lang w:val="en-US"/>
+        </w:rPr>
+      </w:pPr>
+    </w:p>
+    <w:p>
+      <w:pPr>
+        <w:rPr>
+          <w:rFonts w:ascii="IBM Plex Sans" w:hAnsi="IBM Plex Sans"/>
+          <w:lang w:val="en-US"/>
+        </w:rPr>
+      </w:pPr>
+    </w:p>
+    <w:p>
+      <w:pPr>
+        <w:rPr>
+          <w:rFonts w:ascii="IBM Plex Sans" w:hAnsi="IBM Plex Sans"/>
+          <w:lang w:val="en-US"/>
+        </w:rPr>
+      </w:pPr>
+    </w:p>
+    <w:p>
+      <w:pPr>
+        <w:rPr>
+          <w:rFonts w:ascii="IBM Plex Sans" w:hAnsi="IBM Plex Sans"/>
+          <w:lang w:val="en-US"/>
+        </w:rPr>
+      </w:pPr>
+    </w:p>
+    <w:p>
+      <w:pPr>
+        <w:rPr>
+          <w:rFonts w:ascii="IBM Plex Sans" w:hAnsi="IBM Plex Sans"/>
+          <w:lang w:val="en-US"/>
+        </w:rPr>
+      </w:pPr>
+    </w:p>
+    <w:p>
+      <w:pPr>
+        <w:rPr>
+          <w:rFonts w:ascii="IBM Plex Sans" w:hAnsi="IBM Plex Sans"/>
+          <w:lang w:val="en-US"/>
+        </w:rPr>
+      </w:pPr>
+    </w:p>
+    <w:p>
+      <w:pPr>
+        <w:rPr>
+          <w:rFonts w:ascii="IBM Plex Sans" w:hAnsi="IBM Plex Sans"/>
+          <w:lang w:val="en-US"/>
+        </w:rPr>
+      </w:pPr>
+    </w:p>
+    <w:p>
+      <w:pPr>
+        <w:rPr>
+          <w:rFonts w:ascii="IBM Plex Sans" w:hAnsi="IBM Plex Sans"/>
+          <w:lang w:val="en-US"/>
+        </w:rPr>
+      </w:pPr>
     </w:p>
     <w:sectPr>
+      <w:footerReference w:type="even" r:id="rId8"/>
+      <w:footerReference w:type="default" r:id="rId9"/>
       <w:pgSz w:w="11906" w:h="16838"/>
       <w:pgMar w:top="720" w:right="720" w:bottom="720" w:left="720" w:header="709" w:footer="709" w:gutter="0"/>
       <w:cols w:space="708"/>
@@ -314,6 +1499,192 @@
     </w:sectPr>
   </w:body>
 </w:document>
+</file>
+
+<file path=word/endnotes.xml><?xml version="1.0" encoding="utf-8"?>
+<w:endnotes xmlns:wpc="http://schemas.microsoft.com/office/word/2010/wordprocessingCanvas" xmlns:cx="http://schemas.microsoft.com/office/drawing/2014/chartex" xmlns:cx1="http://schemas.microsoft.com/office/drawing/2015/9/8/chartex" xmlns:cx2="http://schemas.microsoft.com/office/drawing/2015/10/21/chartex" xmlns:cx3="http://schemas.microsoft.com/office/drawing/2016/5/9/chartex" xmlns:cx4="http://schemas.microsoft.com/office/drawing/2016/5/10/chartex" xmlns:cx5="http://schemas.microsoft.com/office/drawing/2016/5/11/chartex" xmlns:cx6="http://schemas.microsoft.com/office/drawing/2016/5/12/chartex" xmlns:cx7="http://schemas.microsoft.com/office/drawing/2016/5/13/chartex" xmlns:cx8="http://schemas.microsoft.com/office/drawing/2016/5/14/chartex" xmlns:mc="http://schemas.openxmlformats.org/markup-compatibility/2006" xmlns:aink="http://schemas.microsoft.com/office/drawing/2016/ink" xmlns:am3d="http://schemas.microsoft.com/office/drawing/2017/model3d" xmlns:o="urn:schemas-microsoft-com:office:office" xmlns:oel="http://schemas.microsoft.com/office/2019/extlst" xmlns:r="http://schemas.openxmlformats.org/officeDocument/2006/relationships" xmlns:m="http://schemas.openxmlformats.org/officeDocument/2006/math" xmlns:v="urn:schemas-microsoft-com:vml" xmlns:wp14="http://schemas.microsoft.com/office/word/2010/wordprocessingDrawing" xmlns:wp="http://schemas.openxmlformats.org/drawingml/2006/wordprocessingDrawing" xmlns:w10="urn:schemas-microsoft-com:office:word" xmlns:w="http://schemas.openxmlformats.org/wordprocessingml/2006/main" xmlns:w14="http://schemas.microsoft.com/office/word/2010/wordml" xmlns:w15="http://schemas.microsoft.com/office/word/2012/wordml" xmlns:w16cex="http://schemas.microsoft.com/office/word/2018/wordml/cex" xmlns:w16cid="http://schemas.microsoft.com/office/word/2016/wordml/cid" xmlns:w16="http://schemas.microsoft.com/office/word/2018/wordml" xmlns:w16du="http://schemas.microsoft.com/office/word/2023/wordml/word16du" xmlns:w16sdtdh="http://schemas.microsoft.com/office/word/2020/wordml/sdtdatahash" xmlns:w16sdtfl="http://schemas.microsoft.com/office/word/2024/wordml/sdtformatlock" xmlns:w16se="http://schemas.microsoft.com/office/word/2015/wordml/symex" xmlns:wpg="http://schemas.microsoft.com/office/word/2010/wordprocessingGroup" xmlns:wpi="http://schemas.microsoft.com/office/word/2010/wordprocessingInk" xmlns:wne="http://schemas.microsoft.com/office/word/2006/wordml" xmlns:wps="http://schemas.microsoft.com/office/word/2010/wordprocessingShape" mc:Ignorable="w14 w15 w16se w16cid w16 w16cex w16sdtdh w16sdtfl w16du wp14">
+  <w:endnote w:type="separator" w:id="-1">
+    <w:p>
+      <w:r>
+        <w:separator/>
+      </w:r>
+    </w:p>
+  </w:endnote>
+  <w:endnote w:type="continuationSeparator" w:id="0">
+    <w:p>
+      <w:r>
+        <w:continuationSeparator/>
+      </w:r>
+    </w:p>
+  </w:endnote>
+</w:endnotes>
+</file>
+
+<file path=word/footer1.xml><?xml version="1.0" encoding="utf-8"?>
+<w:ftr xmlns:wpc="http://schemas.microsoft.com/office/word/2010/wordprocessingCanvas" xmlns:cx="http://schemas.microsoft.com/office/drawing/2014/chartex" xmlns:cx1="http://schemas.microsoft.com/office/drawing/2015/9/8/chartex" xmlns:cx2="http://schemas.microsoft.com/office/drawing/2015/10/21/chartex" xmlns:cx3="http://schemas.microsoft.com/office/drawing/2016/5/9/chartex" xmlns:cx4="http://schemas.microsoft.com/office/drawing/2016/5/10/chartex" xmlns:cx5="http://schemas.microsoft.com/office/drawing/2016/5/11/chartex" xmlns:cx6="http://schemas.microsoft.com/office/drawing/2016/5/12/chartex" xmlns:cx7="http://schemas.microsoft.com/office/drawing/2016/5/13/chartex" xmlns:cx8="http://schemas.microsoft.com/office/drawing/2016/5/14/chartex" xmlns:mc="http://schemas.openxmlformats.org/markup-compatibility/2006" xmlns:aink="http://schemas.microsoft.com/office/drawing/2016/ink" xmlns:am3d="http://schemas.microsoft.com/office/drawing/2017/model3d" xmlns:o="urn:schemas-microsoft-com:office:office" xmlns:oel="http://schemas.microsoft.com/office/2019/extlst" xmlns:r="http://schemas.openxmlformats.org/officeDocument/2006/relationships" xmlns:m="http://schemas.openxmlformats.org/officeDocument/2006/math" xmlns:v="urn:schemas-microsoft-com:vml" xmlns:wp14="http://schemas.microsoft.com/office/word/2010/wordprocessingDrawing" xmlns:wp="http://schemas.openxmlformats.org/drawingml/2006/wordprocessingDrawing" xmlns:w10="urn:schemas-microsoft-com:office:word" xmlns:w="http://schemas.openxmlformats.org/wordprocessingml/2006/main" xmlns:w14="http://schemas.microsoft.com/office/word/2010/wordml" xmlns:w15="http://schemas.microsoft.com/office/word/2012/wordml" xmlns:w16cex="http://schemas.microsoft.com/office/word/2018/wordml/cex" xmlns:w16cid="http://schemas.microsoft.com/office/word/2016/wordml/cid" xmlns:w16="http://schemas.microsoft.com/office/word/2018/wordml" xmlns:w16du="http://schemas.microsoft.com/office/word/2023/wordml/word16du" xmlns:w16sdtdh="http://schemas.microsoft.com/office/word/2020/wordml/sdtdatahash" xmlns:w16sdtfl="http://schemas.microsoft.com/office/word/2024/wordml/sdtformatlock" xmlns:w16se="http://schemas.microsoft.com/office/word/2015/wordml/symex" xmlns:wpg="http://schemas.microsoft.com/office/word/2010/wordprocessingGroup" xmlns:wpi="http://schemas.microsoft.com/office/word/2010/wordprocessingInk" xmlns:wne="http://schemas.microsoft.com/office/word/2006/wordml" xmlns:wps="http://schemas.microsoft.com/office/word/2010/wordprocessingShape" mc:Ignorable="w14 w15 w16se w16cid w16 w16cex w16sdtdh w16sdtfl w16du wp14">
+  <w:sdt>
+    <w:sdtPr>
+      <w:rPr>
+        <w:rStyle w:val="Numeropagina"/>
+      </w:rPr>
+      <w:id w:val="1166363837"/>
+      <w:docPartObj>
+        <w:docPartGallery w:val="Page Numbers (Bottom of Page)"/>
+        <w:docPartUnique/>
+      </w:docPartObj>
+    </w:sdtPr>
+    <w:sdtContent>
+      <w:p>
+        <w:pPr>
+          <w:pStyle w:val="Pidipagina"/>
+          <w:framePr w:wrap="none" w:vAnchor="text" w:hAnchor="margin" w:xAlign="center" w:y="1"/>
+          <w:rPr>
+            <w:rStyle w:val="Numeropagina"/>
+          </w:rPr>
+        </w:pPr>
+        <w:r>
+          <w:rPr>
+            <w:rStyle w:val="Numeropagina"/>
+          </w:rPr>
+          <w:fldChar w:fldCharType="begin"/>
+        </w:r>
+        <w:r>
+          <w:rPr>
+            <w:rStyle w:val="Numeropagina"/>
+          </w:rPr>
+          <w:instrText xml:space="preserve"> PAGE </w:instrText>
+        </w:r>
+        <w:r>
+          <w:rPr>
+            <w:rStyle w:val="Numeropagina"/>
+          </w:rPr>
+          <w:fldChar w:fldCharType="end"/>
+        </w:r>
+      </w:p>
+    </w:sdtContent>
+  </w:sdt>
+  <w:p>
+    <w:pPr>
+      <w:pStyle w:val="Pidipagina"/>
+    </w:pPr>
+  </w:p>
+</w:ftr>
+</file>
+
+<file path=word/footer2.xml><?xml version="1.0" encoding="utf-8"?>
+<w:ftr xmlns:wpc="http://schemas.microsoft.com/office/word/2010/wordprocessingCanvas" xmlns:cx="http://schemas.microsoft.com/office/drawing/2014/chartex" xmlns:cx1="http://schemas.microsoft.com/office/drawing/2015/9/8/chartex" xmlns:cx2="http://schemas.microsoft.com/office/drawing/2015/10/21/chartex" xmlns:cx3="http://schemas.microsoft.com/office/drawing/2016/5/9/chartex" xmlns:cx4="http://schemas.microsoft.com/office/drawing/2016/5/10/chartex" xmlns:cx5="http://schemas.microsoft.com/office/drawing/2016/5/11/chartex" xmlns:cx6="http://schemas.microsoft.com/office/drawing/2016/5/12/chartex" xmlns:cx7="http://schemas.microsoft.com/office/drawing/2016/5/13/chartex" xmlns:cx8="http://schemas.microsoft.com/office/drawing/2016/5/14/chartex" xmlns:mc="http://schemas.openxmlformats.org/markup-compatibility/2006" xmlns:aink="http://schemas.microsoft.com/office/drawing/2016/ink" xmlns:am3d="http://schemas.microsoft.com/office/drawing/2017/model3d" xmlns:o="urn:schemas-microsoft-com:office:office" xmlns:oel="http://schemas.microsoft.com/office/2019/extlst" xmlns:r="http://schemas.openxmlformats.org/officeDocument/2006/relationships" xmlns:m="http://schemas.openxmlformats.org/officeDocument/2006/math" xmlns:v="urn:schemas-microsoft-com:vml" xmlns:wp14="http://schemas.microsoft.com/office/word/2010/wordprocessingDrawing" xmlns:wp="http://schemas.openxmlformats.org/drawingml/2006/wordprocessingDrawing" xmlns:w10="urn:schemas-microsoft-com:office:word" xmlns:w="http://schemas.openxmlformats.org/wordprocessingml/2006/main" xmlns:w14="http://schemas.microsoft.com/office/word/2010/wordml" xmlns:w15="http://schemas.microsoft.com/office/word/2012/wordml" xmlns:w16cex="http://schemas.microsoft.com/office/word/2018/wordml/cex" xmlns:w16cid="http://schemas.microsoft.com/office/word/2016/wordml/cid" xmlns:w16="http://schemas.microsoft.com/office/word/2018/wordml" xmlns:w16du="http://schemas.microsoft.com/office/word/2023/wordml/word16du" xmlns:w16sdtdh="http://schemas.microsoft.com/office/word/2020/wordml/sdtdatahash" xmlns:w16sdtfl="http://schemas.microsoft.com/office/word/2024/wordml/sdtformatlock" xmlns:w16se="http://schemas.microsoft.com/office/word/2015/wordml/symex" xmlns:wpg="http://schemas.microsoft.com/office/word/2010/wordprocessingGroup" xmlns:wpi="http://schemas.microsoft.com/office/word/2010/wordprocessingInk" xmlns:wne="http://schemas.microsoft.com/office/word/2006/wordml" xmlns:wps="http://schemas.microsoft.com/office/word/2010/wordprocessingShape" mc:Ignorable="w14 w15 w16se w16cid w16 w16cex w16sdtdh w16sdtfl w16du wp14">
+  <w:sdt>
+    <w:sdtPr>
+      <w:rPr>
+        <w:rStyle w:val="Numeropagina"/>
+      </w:rPr>
+      <w:id w:val="-411540576"/>
+      <w:docPartObj>
+        <w:docPartGallery w:val="Page Numbers (Bottom of Page)"/>
+        <w:docPartUnique/>
+      </w:docPartObj>
+    </w:sdtPr>
+    <w:sdtEndPr>
+      <w:rPr>
+        <w:rStyle w:val="Numeropagina"/>
+        <w:rFonts w:ascii="IBM Plex Sans" w:hAnsi="IBM Plex Sans"/>
+        <w:color w:val="6B7280"/>
+        <w:sz w:val="20"/>
+        <w:szCs w:val="20"/>
+      </w:rPr>
+    </w:sdtEndPr>
+    <w:sdtContent>
+      <w:p>
+        <w:pPr>
+          <w:pStyle w:val="Pidipagina"/>
+          <w:framePr w:wrap="none" w:vAnchor="text" w:hAnchor="margin" w:xAlign="center" w:y="1"/>
+          <w:rPr>
+            <w:rStyle w:val="Numeropagina"/>
+            <w:rFonts w:ascii="IBM Plex Sans" w:hAnsi="IBM Plex Sans"/>
+            <w:color w:val="6B7280"/>
+            <w:sz w:val="20"/>
+            <w:szCs w:val="20"/>
+          </w:rPr>
+        </w:pPr>
+        <w:r>
+          <w:rPr>
+            <w:rStyle w:val="Numeropagina"/>
+            <w:rFonts w:ascii="IBM Plex Sans" w:hAnsi="IBM Plex Sans"/>
+            <w:color w:val="6B7280"/>
+            <w:sz w:val="20"/>
+            <w:szCs w:val="20"/>
+          </w:rPr>
+          <w:fldChar w:fldCharType="begin"/>
+        </w:r>
+        <w:r>
+          <w:rPr>
+            <w:rStyle w:val="Numeropagina"/>
+            <w:rFonts w:ascii="IBM Plex Sans" w:hAnsi="IBM Plex Sans"/>
+            <w:color w:val="6B7280"/>
+            <w:sz w:val="20"/>
+            <w:szCs w:val="20"/>
+          </w:rPr>
+          <w:instrText xml:space="preserve"> PAGE </w:instrText>
+        </w:r>
+        <w:r>
+          <w:rPr>
+            <w:rStyle w:val="Numeropagina"/>
+            <w:rFonts w:ascii="IBM Plex Sans" w:hAnsi="IBM Plex Sans"/>
+            <w:color w:val="6B7280"/>
+            <w:sz w:val="20"/>
+            <w:szCs w:val="20"/>
+          </w:rPr>
+          <w:fldChar w:fldCharType="separate"/>
+        </w:r>
+        <w:r>
+          <w:rPr>
+            <w:rStyle w:val="Numeropagina"/>
+            <w:rFonts w:ascii="IBM Plex Sans" w:hAnsi="IBM Plex Sans"/>
+            <w:noProof/>
+            <w:color w:val="6B7280"/>
+            <w:sz w:val="20"/>
+            <w:szCs w:val="20"/>
+          </w:rPr>
+          <w:t>1</w:t>
+        </w:r>
+        <w:r>
+          <w:rPr>
+            <w:rStyle w:val="Numeropagina"/>
+            <w:rFonts w:ascii="IBM Plex Sans" w:hAnsi="IBM Plex Sans"/>
+            <w:color w:val="6B7280"/>
+            <w:sz w:val="20"/>
+            <w:szCs w:val="20"/>
+          </w:rPr>
+          <w:fldChar w:fldCharType="end"/>
+        </w:r>
+      </w:p>
+    </w:sdtContent>
+  </w:sdt>
+  <w:p>
+    <w:pPr>
+      <w:pStyle w:val="Pidipagina"/>
+    </w:pPr>
+  </w:p>
+</w:ftr>
+</file>
+
+<file path=word/footnotes.xml><?xml version="1.0" encoding="utf-8"?>
+<w:footnotes xmlns:wpc="http://schemas.microsoft.com/office/word/2010/wordprocessingCanvas" xmlns:cx="http://schemas.microsoft.com/office/drawing/2014/chartex" xmlns:cx1="http://schemas.microsoft.com/office/drawing/2015/9/8/chartex" xmlns:cx2="http://schemas.microsoft.com/office/drawing/2015/10/21/chartex" xmlns:cx3="http://schemas.microsoft.com/office/drawing/2016/5/9/chartex" xmlns:cx4="http://schemas.microsoft.com/office/drawing/2016/5/10/chartex" xmlns:cx5="http://schemas.microsoft.com/office/drawing/2016/5/11/chartex" xmlns:cx6="http://schemas.microsoft.com/office/drawing/2016/5/12/chartex" xmlns:cx7="http://schemas.microsoft.com/office/drawing/2016/5/13/chartex" xmlns:cx8="http://schemas.microsoft.com/office/drawing/2016/5/14/chartex" xmlns:mc="http://schemas.openxmlformats.org/markup-compatibility/2006" xmlns:aink="http://schemas.microsoft.com/office/drawing/2016/ink" xmlns:am3d="http://schemas.microsoft.com/office/drawing/2017/model3d" xmlns:o="urn:schemas-microsoft-com:office:office" xmlns:oel="http://schemas.microsoft.com/office/2019/extlst" xmlns:r="http://schemas.openxmlformats.org/officeDocument/2006/relationships" xmlns:m="http://schemas.openxmlformats.org/officeDocument/2006/math" xmlns:v="urn:schemas-microsoft-com:vml" xmlns:wp14="http://schemas.microsoft.com/office/word/2010/wordprocessingDrawing" xmlns:wp="http://schemas.openxmlformats.org/drawingml/2006/wordprocessingDrawing" xmlns:w10="urn:schemas-microsoft-com:office:word" xmlns:w="http://schemas.openxmlformats.org/wordprocessingml/2006/main" xmlns:w14="http://schemas.microsoft.com/office/word/2010/wordml" xmlns:w15="http://schemas.microsoft.com/office/word/2012/wordml" xmlns:w16cex="http://schemas.microsoft.com/office/word/2018/wordml/cex" xmlns:w16cid="http://schemas.microsoft.com/office/word/2016/wordml/cid" xmlns:w16="http://schemas.microsoft.com/office/word/2018/wordml" xmlns:w16du="http://schemas.microsoft.com/office/word/2023/wordml/word16du" xmlns:w16sdtdh="http://schemas.microsoft.com/office/word/2020/wordml/sdtdatahash" xmlns:w16sdtfl="http://schemas.microsoft.com/office/word/2024/wordml/sdtformatlock" xmlns:w16se="http://schemas.microsoft.com/office/word/2015/wordml/symex" xmlns:wpg="http://schemas.microsoft.com/office/word/2010/wordprocessingGroup" xmlns:wpi="http://schemas.microsoft.com/office/word/2010/wordprocessingInk" xmlns:wne="http://schemas.microsoft.com/office/word/2006/wordml" xmlns:wps="http://schemas.microsoft.com/office/word/2010/wordprocessingShape" mc:Ignorable="w14 w15 w16se w16cid w16 w16cex w16sdtdh w16sdtfl w16du wp14">
+  <w:footnote w:type="separator" w:id="-1">
+    <w:p>
+      <w:r>
+        <w:separator/>
+      </w:r>
+    </w:p>
+  </w:footnote>
+  <w:footnote w:type="continuationSeparator" w:id="0">
+    <w:p>
+      <w:r>
+        <w:continuationSeparator/>
+      </w:r>
+    </w:p>
+  </w:footnote>
+</w:footnotes>
 </file>
 
 <file path=word/styles.xml><?xml version="1.0" encoding="utf-8"?>
@@ -1263,6 +2634,56 @@
       <w:u w:val="single"/>
     </w:rPr>
   </w:style>
+  <w:style w:type="paragraph" w:styleId="Pidipagina">
+    <w:name w:val="footer"/>
+    <w:basedOn w:val="Normale"/>
+    <w:link w:val="PidipaginaCarattere"/>
+    <w:uiPriority w:val="99"/>
+    <w:unhideWhenUsed/>
+    <w:rsid w:val="00790F39"/>
+    <w:pPr>
+      <w:tabs>
+        <w:tab w:val="center" w:pos="4819"/>
+        <w:tab w:val="right" w:pos="9638"/>
+      </w:tabs>
+    </w:pPr>
+  </w:style>
+  <w:style w:type="character" w:customStyle="1" w:styleId="PidipaginaCarattere">
+    <w:name w:val="Piè di pagina Carattere"/>
+    <w:basedOn w:val="Carpredefinitoparagrafo"/>
+    <w:link w:val="Pidipagina"/>
+    <w:uiPriority w:val="99"/>
+    <w:rsid w:val="00790F39"/>
+  </w:style>
+  <w:style w:type="character" w:styleId="Numeropagina">
+    <w:name w:val="page number"/>
+    <w:basedOn w:val="Carpredefinitoparagrafo"/>
+    <w:uiPriority w:val="99"/>
+    <w:semiHidden/>
+    <w:unhideWhenUsed/>
+    <w:rsid w:val="00790F39"/>
+  </w:style>
+  <w:style w:type="paragraph" w:styleId="Intestazione">
+    <w:name w:val="header"/>
+    <w:basedOn w:val="Normale"/>
+    <w:link w:val="IntestazioneCarattere"/>
+    <w:uiPriority w:val="99"/>
+    <w:unhideWhenUsed/>
+    <w:rsid w:val="00790F39"/>
+    <w:pPr>
+      <w:tabs>
+        <w:tab w:val="center" w:pos="4819"/>
+        <w:tab w:val="right" w:pos="9638"/>
+      </w:tabs>
+    </w:pPr>
+  </w:style>
+  <w:style w:type="character" w:customStyle="1" w:styleId="IntestazioneCarattere">
+    <w:name w:val="Intestazione Carattere"/>
+    <w:basedOn w:val="Carpredefinitoparagrafo"/>
+    <w:link w:val="Intestazione"/>
+    <w:uiPriority w:val="99"/>
+    <w:rsid w:val="00790F39"/>
+  </w:style>
 </w:styles>
 </file>
 

</xml_diff>